<commit_message>
fix(hr): finalizar pacote admissional e acompanhamento
</commit_message>
<xml_diff>
--- a/docs/modelos-documentos/admissionais/01-contrato-experiencia-v4.docx
+++ b/docs/modelos-documentos/admissionais/01-contrato-experiencia-v4.docx
@@ -22,7 +22,7 @@
           <w:b/>
           <w:bCs/>
         </w:rPr>
-        <w:t xml:space="preserve">{{integration.employer_name}}</w:t>
+        <w:t xml:space="preserve">{{integration.employer_legal_name}}</w:t>
       </w:r>
       <w:r>
         <w:t xml:space="preserve">, inscrita sob </w:t>
@@ -445,7 +445,7 @@
               <w:rPr>
                 <w:rStyle w:val="CTAssinaturaNome"/>
               </w:rPr>
-              <w:t xml:space="preserve">{{integration.employer_name}}</w:t>
+              <w:t xml:space="preserve">{{integration.employer_legal_name}}</w:t>
             </w:r>
           </w:p>
           <w:p>

</xml_diff>

<commit_message>
fix(hr): finalizar pacote admissional e sincronizacao do PDV (#47)
Inclui os ajustes finais do PDF e acompanhamento de assinaturas, alem da compatibilidade de salvamento e sincronizacao de unidades para cadastros legados do PDV.
</commit_message>
<xml_diff>
--- a/docs/modelos-documentos/admissionais/01-contrato-experiencia-v4.docx
+++ b/docs/modelos-documentos/admissionais/01-contrato-experiencia-v4.docx
@@ -22,7 +22,7 @@
           <w:b/>
           <w:bCs/>
         </w:rPr>
-        <w:t xml:space="preserve">{{integration.employer_name}}</w:t>
+        <w:t xml:space="preserve">{{integration.employer_legal_name}}</w:t>
       </w:r>
       <w:r>
         <w:t xml:space="preserve">, inscrita sob </w:t>
@@ -445,7 +445,7 @@
               <w:rPr>
                 <w:rStyle w:val="CTAssinaturaNome"/>
               </w:rPr>
-              <w:t xml:space="preserve">{{integration.employer_name}}</w:t>
+              <w:t xml:space="preserve">{{integration.employer_legal_name}}</w:t>
             </w:r>
           </w:p>
           <w:p>

</xml_diff>